<commit_message>
Add 500kV analysis and update macOS guide
</commit_message>
<xml_diff>
--- a/每日生产经营情况汇报自动生成工具/模板/每日生产经营情况汇报（自动）.docx
+++ b/每日生产经营情况汇报自动生成工具/模板/每日生产经营情况汇报（自动）.docx
@@ -221,28 +221,11 @@
       <w:r>
         <w:rPr>
           <w:rFonts w:ascii="仿宋" w:eastAsia="仿宋" w:hAnsi="仿宋" w:cs="宋体" w:hint="eastAsia"/>
-          <w:color w:val="FF0000"/>
-          <w:sz w:val="32"/>
-          <w:szCs w:val="32"/>
-        </w:rPr>
-        <w:t>1</w:t>
-      </w:r>
-      <w:r>
-        <w:rPr>
-          <w:rFonts w:ascii="仿宋" w:eastAsia="仿宋" w:hAnsi="仿宋" w:cs="宋体" w:hint="eastAsia"/>
-          <w:color w:val="FF0000"/>
-          <w:sz w:val="32"/>
-          <w:szCs w:val="32"/>
-        </w:rPr>
-        <w:t>3</w:t>
-      </w:r>
-      <w:r>
-        <w:rPr>
-          <w:rFonts w:ascii="仿宋" w:eastAsia="仿宋" w:hAnsi="仿宋" w:cs="宋体" w:hint="eastAsia"/>
-          <w:sz w:val="32"/>
-          <w:szCs w:val="32"/>
-        </w:rPr>
-        <w:t>日：</w:t>
+          <w:color w:val="000000"/>
+          <w:sz w:val="32"/>
+          <w:szCs w:val="32"/>
+        </w:rPr>
+        <w:t>清远厂：</w:t>
       </w:r>
     </w:p>
     <w:p>
@@ -251,7 +234,6 @@
         <w:ind w:firstLineChars="200" w:firstLine="640"/>
         <w:rPr>
           <w:rFonts w:ascii="仿宋" w:eastAsia="仿宋" w:hAnsi="仿宋" w:cs="宋体" w:hint="eastAsia"/>
-          <w:color w:val="000000" w:themeColor="text1"/>
           <w:sz w:val="32"/>
           <w:szCs w:val="32"/>
         </w:rPr>
@@ -259,20 +241,28 @@
       <w:r>
         <w:rPr>
           <w:rFonts w:ascii="仿宋" w:eastAsia="仿宋" w:hAnsi="仿宋" w:cs="宋体" w:hint="eastAsia"/>
-          <w:color w:val="000000" w:themeColor="text1"/>
-          <w:sz w:val="32"/>
-          <w:szCs w:val="32"/>
-        </w:rPr>
-        <w:t>汕头厂：</w:t>
-      </w:r>
-      <w:r>
-        <w:rPr>
-          <w:rFonts w:ascii="仿宋" w:eastAsia="仿宋" w:hAnsi="仿宋" w:cs="宋体" w:hint="eastAsia"/>
-          <w:color w:val="000000" w:themeColor="text1"/>
-          <w:sz w:val="32"/>
-          <w:szCs w:val="32"/>
-        </w:rPr>
-        <w:t>与前一日运行方式一致。</w:t>
+          <w:color w:val="FF0000"/>
+          <w:sz w:val="32"/>
+          <w:szCs w:val="32"/>
+        </w:rPr>
+        <w:t>1</w:t>
+      </w:r>
+      <w:r>
+        <w:rPr>
+          <w:rFonts w:ascii="仿宋" w:eastAsia="仿宋" w:hAnsi="仿宋" w:cs="宋体" w:hint="eastAsia"/>
+          <w:color w:val="FF0000"/>
+          <w:sz w:val="32"/>
+          <w:szCs w:val="32"/>
+        </w:rPr>
+        <w:t>3</w:t>
+      </w:r>
+      <w:r>
+        <w:rPr>
+          <w:rFonts w:ascii="仿宋" w:eastAsia="仿宋" w:hAnsi="仿宋" w:cs="宋体" w:hint="eastAsia"/>
+          <w:sz w:val="32"/>
+          <w:szCs w:val="32"/>
+        </w:rPr>
+        <w:t>日：</w:t>
       </w:r>
     </w:p>
     <w:p>
@@ -293,7 +283,16 @@
           <w:sz w:val="32"/>
           <w:szCs w:val="32"/>
         </w:rPr>
-        <w:t>海门厂：与前一日运行方式一致。</w:t>
+        <w:t>汕头厂：</w:t>
+      </w:r>
+      <w:r>
+        <w:rPr>
+          <w:rFonts w:ascii="仿宋" w:eastAsia="仿宋" w:hAnsi="仿宋" w:cs="宋体" w:hint="eastAsia"/>
+          <w:color w:val="000000" w:themeColor="text1"/>
+          <w:sz w:val="32"/>
+          <w:szCs w:val="32"/>
+        </w:rPr>
+        <w:t>与前一日运行方式一致。</w:t>
       </w:r>
     </w:p>
     <w:p>
@@ -302,6 +301,7 @@
         <w:ind w:firstLineChars="200" w:firstLine="640"/>
         <w:rPr>
           <w:rFonts w:ascii="仿宋" w:eastAsia="仿宋" w:hAnsi="仿宋" w:cs="宋体" w:hint="eastAsia"/>
+          <w:color w:val="000000" w:themeColor="text1"/>
           <w:sz w:val="32"/>
           <w:szCs w:val="32"/>
         </w:rPr>
@@ -313,6 +313,26 @@
           <w:sz w:val="32"/>
           <w:szCs w:val="32"/>
         </w:rPr>
+        <w:t>海门厂：与前一日运行方式一致。</w:t>
+      </w:r>
+    </w:p>
+    <w:p>
+      <w:pPr>
+        <w:spacing w:line="560" w:lineRule="exact"/>
+        <w:ind w:firstLineChars="200" w:firstLine="640"/>
+        <w:rPr>
+          <w:rFonts w:ascii="仿宋" w:eastAsia="仿宋" w:hAnsi="仿宋" w:cs="宋体" w:hint="eastAsia"/>
+          <w:sz w:val="32"/>
+          <w:szCs w:val="32"/>
+        </w:rPr>
+      </w:pPr>
+      <w:r>
+        <w:rPr>
+          <w:rFonts w:ascii="仿宋" w:eastAsia="仿宋" w:hAnsi="仿宋" w:cs="宋体" w:hint="eastAsia"/>
+          <w:color w:val="000000" w:themeColor="text1"/>
+          <w:sz w:val="32"/>
+          <w:szCs w:val="32"/>
+        </w:rPr>
         <w:t>东莞厂：</w:t>
       </w:r>
       <w:r>
@@ -386,6 +406,26 @@
           <w:szCs w:val="32"/>
         </w:rPr>
         <w:t>。</w:t>
+      </w:r>
+    </w:p>
+    <w:p>
+      <w:pPr>
+        <w:spacing w:line="560" w:lineRule="exact"/>
+        <w:ind w:firstLineChars="200" w:firstLine="640"/>
+        <w:rPr>
+          <w:rFonts w:ascii="仿宋" w:eastAsia="仿宋" w:hAnsi="仿宋" w:cs="宋体" w:hint="eastAsia"/>
+          <w:sz w:val="32"/>
+          <w:szCs w:val="32"/>
+        </w:rPr>
+      </w:pPr>
+      <w:r>
+        <w:rPr>
+          <w:rFonts w:ascii="仿宋" w:eastAsia="仿宋" w:hAnsi="仿宋" w:cs="宋体" w:hint="eastAsia"/>
+          <w:color w:val="000000"/>
+          <w:sz w:val="32"/>
+          <w:szCs w:val="32"/>
+        </w:rPr>
+        <w:t>清远厂：</w:t>
       </w:r>
     </w:p>
     <w:p>
@@ -4502,6 +4542,475 @@
                 <w:szCs w:val="18"/>
               </w:rPr>
               <w:t xml:space="preserve">8423 </w:t>
+            </w:r>
+          </w:p>
+        </w:tc>
+      </w:tr>
+      <w:tr>
+        <w:trPr>
+          <w:trHeight w:val="240"/>
+          <w:jc w:val="center"/>
+        </w:trPr>
+        <w:tc>
+          <w:tcPr>
+            <w:tcW w:w="1407" w:type="dxa"/>
+            <w:shd w:val="clear" w:color="auto" w:fill="auto"/>
+            <w:tcMar>
+              <w:top w:w="0" w:type="dxa"/>
+              <w:left w:w="11" w:type="dxa"/>
+              <w:bottom w:w="0" w:type="dxa"/>
+              <w:right w:w="11" w:type="dxa"/>
+            </w:tcMar>
+            <w:vAlign w:val="center"/>
+          </w:tcPr>
+          <w:p>
+            <w:pPr>
+              <w:widowControl/>
+              <w:jc w:val="center"/>
+              <w:textAlignment w:val="center"/>
+              <w:rPr>
+                <w:rFonts w:ascii="微软雅黑" w:eastAsia="微软雅黑" w:hAnsi="微软雅黑" w:cs="微软雅黑" w:hint="eastAsia"/>
+                <w:b/>
+                <w:bCs/>
+                <w:color w:val="000000"/>
+                <w:sz w:val="18"/>
+                <w:szCs w:val="18"/>
+              </w:rPr>
+            </w:pPr>
+            <w:proofErr w:type="gramStart"/>
+            <w:proofErr w:type="gramEnd"/>
+            <w:r>
+              <w:rPr>
+                <w:rFonts w:ascii="微软雅黑" w:eastAsia="微软雅黑" w:hAnsi="微软雅黑" w:cs="微软雅黑" w:hint="eastAsia"/>
+                <w:b/>
+                <w:bCs/>
+                <w:color w:val="000000"/>
+                <w:kern w:val="0"/>
+                <w:sz w:val="18"/>
+                <w:szCs w:val="18"/>
+                <w:lang w:bidi="ar"/>
+              </w:rPr>
+              <w:t>清  远</w:t>
+            </w:r>
+          </w:p>
+        </w:tc>
+        <w:tc>
+          <w:tcPr>
+            <w:tcW w:w="684" w:type="dxa"/>
+            <w:shd w:val="clear" w:color="auto" w:fill="auto"/>
+            <w:tcMar>
+              <w:top w:w="0" w:type="dxa"/>
+              <w:left w:w="11" w:type="dxa"/>
+              <w:bottom w:w="0" w:type="dxa"/>
+              <w:right w:w="11" w:type="dxa"/>
+            </w:tcMar>
+            <w:vAlign w:val="center"/>
+          </w:tcPr>
+          <w:p>
+            <w:pPr>
+              <w:widowControl/>
+              <w:jc w:val="center"/>
+              <w:textAlignment w:val="center"/>
+              <w:rPr>
+                <w:rFonts w:ascii="微软雅黑" w:eastAsia="微软雅黑" w:hAnsi="微软雅黑" w:cs="微软雅黑" w:hint="eastAsia"/>
+                <w:color w:val="0000FF"/>
+                <w:sz w:val="18"/>
+                <w:szCs w:val="18"/>
+              </w:rPr>
+            </w:pPr>
+            <w:r>
+              <w:rPr>
+                <w:rFonts w:ascii="微软雅黑" w:eastAsia="微软雅黑" w:hAnsi="微软雅黑" w:hint="eastAsia"/>
+                <w:color w:val="000000"/>
+                <w:sz w:val="18"/>
+                <w:szCs w:val="18"/>
+              </w:rPr>
+              <w:t>220</w:t>
+            </w:r>
+          </w:p>
+        </w:tc>
+        <w:tc>
+          <w:tcPr>
+            <w:tcW w:w="684" w:type="dxa"/>
+            <w:shd w:val="clear" w:color="auto" w:fill="auto"/>
+            <w:tcMar>
+              <w:top w:w="0" w:type="dxa"/>
+              <w:left w:w="11" w:type="dxa"/>
+              <w:bottom w:w="0" w:type="dxa"/>
+              <w:right w:w="11" w:type="dxa"/>
+            </w:tcMar>
+            <w:vAlign w:val="center"/>
+          </w:tcPr>
+          <w:p>
+            <w:pPr>
+              <w:widowControl/>
+              <w:jc w:val="center"/>
+              <w:textAlignment w:val="center"/>
+              <w:rPr>
+                <w:rFonts w:ascii="微软雅黑" w:eastAsia="微软雅黑" w:hAnsi="微软雅黑" w:cs="微软雅黑" w:hint="eastAsia"/>
+                <w:color w:val="0000FF"/>
+                <w:sz w:val="18"/>
+                <w:szCs w:val="18"/>
+              </w:rPr>
+            </w:pPr>
+            <w:r>
+              <w:rPr>
+                <w:rFonts w:ascii="微软雅黑" w:eastAsia="微软雅黑" w:hAnsi="微软雅黑" w:hint="eastAsia"/>
+                <w:color w:val="000000"/>
+                <w:sz w:val="18"/>
+                <w:szCs w:val="18"/>
+              </w:rPr>
+              <w:t>669</w:t>
+            </w:r>
+          </w:p>
+        </w:tc>
+        <w:tc>
+          <w:tcPr>
+            <w:tcW w:w="684" w:type="dxa"/>
+            <w:shd w:val="clear" w:color="auto" w:fill="auto"/>
+            <w:tcMar>
+              <w:top w:w="0" w:type="dxa"/>
+              <w:left w:w="11" w:type="dxa"/>
+              <w:bottom w:w="0" w:type="dxa"/>
+              <w:right w:w="11" w:type="dxa"/>
+            </w:tcMar>
+            <w:vAlign w:val="center"/>
+          </w:tcPr>
+          <w:p>
+            <w:pPr>
+              <w:widowControl/>
+              <w:jc w:val="center"/>
+              <w:textAlignment w:val="center"/>
+              <w:rPr>
+                <w:rFonts w:ascii="微软雅黑" w:eastAsia="微软雅黑" w:hAnsi="微软雅黑" w:cs="微软雅黑" w:hint="eastAsia"/>
+                <w:color w:val="0000FF"/>
+                <w:sz w:val="18"/>
+                <w:szCs w:val="18"/>
+              </w:rPr>
+            </w:pPr>
+            <w:r>
+              <w:rPr>
+                <w:rFonts w:ascii="微软雅黑" w:eastAsia="微软雅黑" w:hAnsi="微软雅黑" w:hint="eastAsia"/>
+                <w:color w:val="000000"/>
+                <w:sz w:val="18"/>
+                <w:szCs w:val="18"/>
+              </w:rPr>
+              <w:t>/</w:t>
+            </w:r>
+          </w:p>
+        </w:tc>
+        <w:tc>
+          <w:tcPr>
+            <w:tcW w:w="684" w:type="dxa"/>
+            <w:shd w:val="clear" w:color="auto" w:fill="auto"/>
+            <w:tcMar>
+              <w:top w:w="0" w:type="dxa"/>
+              <w:left w:w="11" w:type="dxa"/>
+              <w:bottom w:w="0" w:type="dxa"/>
+              <w:right w:w="11" w:type="dxa"/>
+            </w:tcMar>
+            <w:vAlign w:val="center"/>
+          </w:tcPr>
+          <w:p>
+            <w:pPr>
+              <w:widowControl/>
+              <w:jc w:val="center"/>
+              <w:textAlignment w:val="center"/>
+              <w:rPr>
+                <w:rFonts w:ascii="微软雅黑" w:eastAsia="微软雅黑" w:hAnsi="微软雅黑" w:cs="微软雅黑" w:hint="eastAsia"/>
+                <w:color w:val="0000FF"/>
+                <w:sz w:val="18"/>
+                <w:szCs w:val="18"/>
+              </w:rPr>
+            </w:pPr>
+            <w:r>
+              <w:rPr>
+                <w:rFonts w:ascii="微软雅黑" w:eastAsia="微软雅黑" w:hAnsi="微软雅黑" w:hint="eastAsia"/>
+                <w:color w:val="000000"/>
+                <w:sz w:val="18"/>
+                <w:szCs w:val="18"/>
+              </w:rPr>
+              <w:t>/</w:t>
+            </w:r>
+          </w:p>
+        </w:tc>
+        <w:tc>
+          <w:tcPr>
+            <w:tcW w:w="684" w:type="dxa"/>
+            <w:shd w:val="clear" w:color="auto" w:fill="auto"/>
+            <w:tcMar>
+              <w:top w:w="0" w:type="dxa"/>
+              <w:left w:w="11" w:type="dxa"/>
+              <w:bottom w:w="0" w:type="dxa"/>
+              <w:right w:w="11" w:type="dxa"/>
+            </w:tcMar>
+            <w:vAlign w:val="center"/>
+          </w:tcPr>
+          <w:p>
+            <w:pPr>
+              <w:widowControl/>
+              <w:jc w:val="center"/>
+              <w:textAlignment w:val="center"/>
+              <w:rPr>
+                <w:rFonts w:ascii="微软雅黑" w:eastAsia="微软雅黑" w:hAnsi="微软雅黑" w:cs="微软雅黑" w:hint="eastAsia"/>
+                <w:color w:val="0000FF"/>
+                <w:sz w:val="18"/>
+                <w:szCs w:val="18"/>
+              </w:rPr>
+            </w:pPr>
+            <w:r>
+              <w:rPr>
+                <w:rFonts w:ascii="微软雅黑" w:eastAsia="微软雅黑" w:hAnsi="微软雅黑" w:hint="eastAsia"/>
+                <w:color w:val="000000"/>
+                <w:sz w:val="18"/>
+                <w:szCs w:val="18"/>
+              </w:rPr>
+              <w:t>/</w:t>
+            </w:r>
+          </w:p>
+        </w:tc>
+        <w:tc>
+          <w:tcPr>
+            <w:tcW w:w="684" w:type="dxa"/>
+            <w:shd w:val="clear" w:color="auto" w:fill="auto"/>
+            <w:tcMar>
+              <w:top w:w="0" w:type="dxa"/>
+              <w:left w:w="11" w:type="dxa"/>
+              <w:bottom w:w="0" w:type="dxa"/>
+              <w:right w:w="11" w:type="dxa"/>
+            </w:tcMar>
+            <w:vAlign w:val="center"/>
+          </w:tcPr>
+          <w:p>
+            <w:pPr>
+              <w:widowControl/>
+              <w:jc w:val="center"/>
+              <w:textAlignment w:val="center"/>
+              <w:rPr>
+                <w:rFonts w:ascii="微软雅黑" w:eastAsia="微软雅黑" w:hAnsi="微软雅黑" w:cs="微软雅黑" w:hint="eastAsia"/>
+                <w:color w:val="0000FF"/>
+                <w:sz w:val="18"/>
+                <w:szCs w:val="18"/>
+              </w:rPr>
+            </w:pPr>
+            <w:r>
+              <w:rPr>
+                <w:rFonts w:ascii="微软雅黑" w:eastAsia="微软雅黑" w:hAnsi="微软雅黑" w:hint="eastAsia"/>
+                <w:color w:val="000000"/>
+                <w:sz w:val="18"/>
+                <w:szCs w:val="18"/>
+              </w:rPr>
+              <w:t>/</w:t>
+            </w:r>
+          </w:p>
+        </w:tc>
+        <w:tc>
+          <w:tcPr>
+            <w:tcW w:w="684" w:type="dxa"/>
+            <w:shd w:val="clear" w:color="auto" w:fill="auto"/>
+            <w:tcMar>
+              <w:top w:w="0" w:type="dxa"/>
+              <w:left w:w="11" w:type="dxa"/>
+              <w:bottom w:w="0" w:type="dxa"/>
+              <w:right w:w="11" w:type="dxa"/>
+            </w:tcMar>
+            <w:vAlign w:val="center"/>
+          </w:tcPr>
+          <w:p>
+            <w:pPr>
+              <w:widowControl/>
+              <w:jc w:val="center"/>
+              <w:textAlignment w:val="center"/>
+              <w:rPr>
+                <w:rFonts w:ascii="微软雅黑" w:eastAsia="微软雅黑" w:hAnsi="微软雅黑" w:cs="微软雅黑" w:hint="eastAsia"/>
+                <w:color w:val="0000FF"/>
+                <w:sz w:val="18"/>
+                <w:szCs w:val="18"/>
+              </w:rPr>
+            </w:pPr>
+            <w:r>
+              <w:rPr>
+                <w:rFonts w:ascii="微软雅黑" w:eastAsia="微软雅黑" w:hAnsi="微软雅黑" w:hint="eastAsia"/>
+                <w:color w:val="000000"/>
+                <w:sz w:val="18"/>
+                <w:szCs w:val="18"/>
+              </w:rPr>
+              <w:t>220</w:t>
+            </w:r>
+          </w:p>
+        </w:tc>
+        <w:tc>
+          <w:tcPr>
+            <w:tcW w:w="684" w:type="dxa"/>
+            <w:shd w:val="clear" w:color="auto" w:fill="auto"/>
+            <w:tcMar>
+              <w:top w:w="0" w:type="dxa"/>
+              <w:left w:w="11" w:type="dxa"/>
+              <w:bottom w:w="0" w:type="dxa"/>
+              <w:right w:w="11" w:type="dxa"/>
+            </w:tcMar>
+            <w:vAlign w:val="center"/>
+          </w:tcPr>
+          <w:p>
+            <w:pPr>
+              <w:widowControl/>
+              <w:jc w:val="center"/>
+              <w:textAlignment w:val="center"/>
+              <w:rPr>
+                <w:rFonts w:ascii="微软雅黑" w:eastAsia="微软雅黑" w:hAnsi="微软雅黑" w:cs="微软雅黑" w:hint="eastAsia"/>
+                <w:color w:val="0000FF"/>
+                <w:sz w:val="18"/>
+                <w:szCs w:val="18"/>
+              </w:rPr>
+            </w:pPr>
+            <w:r>
+              <w:rPr>
+                <w:rFonts w:ascii="微软雅黑" w:eastAsia="微软雅黑" w:hAnsi="微软雅黑" w:hint="eastAsia"/>
+                <w:color w:val="000000"/>
+                <w:sz w:val="18"/>
+                <w:szCs w:val="18"/>
+              </w:rPr>
+              <w:t>13</w:t>
+            </w:r>
+          </w:p>
+        </w:tc>
+        <w:tc>
+          <w:tcPr>
+            <w:tcW w:w="885" w:type="dxa"/>
+            <w:shd w:val="clear" w:color="auto" w:fill="auto"/>
+            <w:tcMar>
+              <w:top w:w="0" w:type="dxa"/>
+              <w:left w:w="11" w:type="dxa"/>
+              <w:bottom w:w="0" w:type="dxa"/>
+              <w:right w:w="11" w:type="dxa"/>
+            </w:tcMar>
+            <w:vAlign w:val="center"/>
+          </w:tcPr>
+          <w:p>
+            <w:pPr>
+              <w:widowControl/>
+              <w:jc w:val="center"/>
+              <w:textAlignment w:val="center"/>
+              <w:rPr>
+                <w:rFonts w:ascii="微软雅黑" w:eastAsia="微软雅黑" w:hAnsi="微软雅黑" w:cs="微软雅黑" w:hint="eastAsia"/>
+                <w:color w:val="000000" w:themeColor="text1"/>
+                <w:sz w:val="18"/>
+                <w:szCs w:val="18"/>
+              </w:rPr>
+            </w:pPr>
+            <w:r>
+              <w:rPr>
+                <w:rFonts w:ascii="微软雅黑" w:eastAsia="微软雅黑" w:hAnsi="微软雅黑" w:hint="eastAsia"/>
+                <w:color w:val="000000"/>
+                <w:sz w:val="18"/>
+                <w:szCs w:val="18"/>
+              </w:rPr>
+              <w:t>/</w:t>
+            </w:r>
+          </w:p>
+        </w:tc>
+        <w:tc>
+          <w:tcPr>
+            <w:tcW w:w="978" w:type="dxa"/>
+            <w:shd w:val="clear" w:color="auto" w:fill="auto"/>
+            <w:tcMar>
+              <w:top w:w="0" w:type="dxa"/>
+              <w:left w:w="11" w:type="dxa"/>
+              <w:bottom w:w="0" w:type="dxa"/>
+              <w:right w:w="11" w:type="dxa"/>
+            </w:tcMar>
+            <w:vAlign w:val="center"/>
+          </w:tcPr>
+          <w:p>
+            <w:pPr>
+              <w:widowControl/>
+              <w:jc w:val="center"/>
+              <w:textAlignment w:val="center"/>
+              <w:rPr>
+                <w:rFonts w:ascii="微软雅黑" w:eastAsia="微软雅黑" w:hAnsi="微软雅黑" w:cs="微软雅黑" w:hint="eastAsia"/>
+                <w:color w:val="0000FF"/>
+                <w:sz w:val="18"/>
+                <w:szCs w:val="18"/>
+              </w:rPr>
+            </w:pPr>
+            <w:r>
+              <w:rPr>
+                <w:rFonts w:ascii="微软雅黑" w:eastAsia="微软雅黑" w:hAnsi="微软雅黑" w:hint="eastAsia"/>
+                <w:color w:val="000000"/>
+                <w:sz w:val="18"/>
+                <w:szCs w:val="18"/>
+              </w:rPr>
+              <w:t>13</w:t>
+            </w:r>
+          </w:p>
+        </w:tc>
+        <w:tc>
+          <w:tcPr>
+            <w:tcW w:w="984" w:type="dxa"/>
+            <w:shd w:val="clear" w:color="auto" w:fill="auto"/>
+            <w:tcMar>
+              <w:top w:w="0" w:type="dxa"/>
+              <w:left w:w="11" w:type="dxa"/>
+              <w:bottom w:w="0" w:type="dxa"/>
+              <w:right w:w="11" w:type="dxa"/>
+            </w:tcMar>
+            <w:vAlign w:val="center"/>
+          </w:tcPr>
+          <w:p>
+            <w:pPr>
+              <w:widowControl/>
+              <w:jc w:val="center"/>
+              <w:textAlignment w:val="center"/>
+              <w:rPr>
+                <w:rFonts w:ascii="微软雅黑" w:eastAsia="微软雅黑" w:hAnsi="微软雅黑" w:cs="微软雅黑" w:hint="eastAsia"/>
+                <w:color w:val="0000FF"/>
+                <w:sz w:val="18"/>
+                <w:szCs w:val="18"/>
+              </w:rPr>
+            </w:pPr>
+            <w:r>
+              <w:rPr>
+                <w:rFonts w:ascii="微软雅黑" w:eastAsia="微软雅黑" w:hAnsi="微软雅黑" w:hint="eastAsia"/>
+                <w:color w:val="000000"/>
+                <w:sz w:val="18"/>
+                <w:szCs w:val="18"/>
+              </w:rPr>
+              <w:t>669</w:t>
+            </w:r>
+          </w:p>
+        </w:tc>
+        <w:tc>
+          <w:tcPr>
+            <w:tcW w:w="984" w:type="dxa"/>
+            <w:shd w:val="clear" w:color="auto" w:fill="auto"/>
+            <w:tcMar>
+              <w:top w:w="0" w:type="dxa"/>
+              <w:left w:w="11" w:type="dxa"/>
+              <w:bottom w:w="0" w:type="dxa"/>
+              <w:right w:w="11" w:type="dxa"/>
+            </w:tcMar>
+            <w:vAlign w:val="center"/>
+          </w:tcPr>
+          <w:p>
+            <w:pPr>
+              <w:widowControl/>
+              <w:jc w:val="center"/>
+              <w:textAlignment w:val="center"/>
+              <w:rPr>
+                <w:rFonts w:ascii="微软雅黑" w:eastAsia="微软雅黑" w:hAnsi="微软雅黑" w:cs="微软雅黑" w:hint="eastAsia"/>
+                <w:color w:val="0000FF"/>
+                <w:sz w:val="18"/>
+                <w:szCs w:val="18"/>
+              </w:rPr>
+            </w:pPr>
+            <w:r>
+              <w:rPr>
+                <w:rFonts w:ascii="微软雅黑" w:eastAsia="微软雅黑" w:hAnsi="微软雅黑" w:hint="eastAsia"/>
+                <w:color w:val="000000"/>
+                <w:sz w:val="18"/>
+                <w:szCs w:val="18"/>
+              </w:rPr>
+              <w:t>756</w:t>
             </w:r>
           </w:p>
         </w:tc>

</xml_diff>